<commit_message>
Clase 4: rehacer con Playwright en TypeScript, POM y VS Code
Se reemplaza el proyecto Java/Gradle por Playwright Test 1.63.0 con
TypeScript: LoginPage y ProductosPage, datos en data/usuarios.ts,
login.spec.ts con dos pruebas y casos inválidos con un for, reporte
HTML, captura y traza en fallo, y recomendación de la extensión de
Playwright para VS Code. Nuevos README, guía de estudio, presentación
y actividad.

Co-Authored-By: Claude Opus 5 (1M context) <noreply@anthropic.com>
Claude-Session: https://claude.ai/code/session_01L2JuF1iG72koPJkmuRWSzm
</commit_message>
<xml_diff>
--- a/material-de-apoyo/Clase4_Actividad_Playwright_POM.docx
+++ b/material-de-apoyo/Clase4_Actividad_Playwright_POM.docx
@@ -241,7 +241,7 @@
         <w:rPr>
           <w:b w:val="0"/>
         </w:rPr>
-        <w:t xml:space="preserve">En clase automatizamos el login de saucedemo.com con POM. Ahora vas a dar un paso más: después de iniciar sesión, agregar la mochila (Sauce Labs Backpack) al carrito y comprobar que el numerito rojo del carrito diga 1. Trabajas sobre el proyecto de la rama </w:t>
+        <w:t xml:space="preserve">En clase automatizamos el login de saucedemo.com con Playwright y POM. Ahora vas a dar un paso más: después de iniciar sesión, agregar la mochila (Sauce Labs Backpack) al carrito y comprobar que el numerito rojo del carrito diga 1. Trabajas sobre el proyecto de la rama </w:t>
       </w:r>
       <w:r>
         <w:rPr>
@@ -254,22 +254,14 @@
         <w:rPr>
           <w:b w:val="0"/>
         </w:rPr>
-        <w:t>.</w:t>
-      </w:r>
-    </w:p>
-    <w:p>
-      <w:r>
-        <w:rPr>
-          <w:b w:val="0"/>
-        </w:rPr>
-        <w:t xml:space="preserve">No necesitas crear nada raro. Todo lo que vas a escribir se parece a algo que ya está en el proyecto: si te pierdes, mira cómo está hecho </w:t>
+        <w:t xml:space="preserve">, en VS Code. Si te pierdes, mira cómo están hechos </w:t>
       </w:r>
       <w:r>
         <w:rPr>
           <w:rFonts w:ascii="Consolas" w:hAnsi="Consolas" w:eastAsia="Consolas"/>
           <w:color w:val="003D7A"/>
         </w:rPr>
-        <w:t>LoginPage</w:t>
+        <w:t>pages/LoginPage.ts</w:t>
       </w:r>
       <w:r>
         <w:rPr>
@@ -282,7 +274,7 @@
           <w:rFonts w:ascii="Consolas" w:hAnsi="Consolas" w:eastAsia="Consolas"/>
           <w:color w:val="003D7A"/>
         </w:rPr>
-        <w:t>LoginTest</w:t>
+        <w:t>tests/login.spec.ts</w:t>
       </w:r>
       <w:r>
         <w:rPr>
@@ -327,7 +319,7 @@
         <w:rPr>
           <w:b w:val="0"/>
         </w:rPr>
-        <w:t>Inicia sesión en saucedemo.com con Chrome (</w:t>
+        <w:t xml:space="preserve">Corre una prueba con Show browser, o abre saucedemo.com en Chrome e inicia sesión con </w:t>
       </w:r>
       <w:r>
         <w:rPr>
@@ -353,7 +345,7 @@
         <w:rPr>
           <w:b w:val="0"/>
         </w:rPr>
-        <w:t xml:space="preserve">). Haz clic derecho sobre el botón Add to cart de la mochila y elige Inspeccionar. Anota su atributo </w:t>
+        <w:t xml:space="preserve">. Con Pick locator de VS Code (o clic derecho, Inspeccionar) busca el botón Add to cart de la mochila y anota su </w:t>
       </w:r>
       <w:r>
         <w:rPr>
@@ -366,7 +358,7 @@
         <w:rPr>
           <w:b w:val="0"/>
         </w:rPr>
-        <w:t>. Luego agrega la mochila a mano y haz lo mismo con el numerito rojo que aparece sobre el carrito.</w:t>
+        <w:t>. Agrega la mochila a mano y haz lo mismo con el numerito rojo del carrito.</w:t>
       </w:r>
     </w:p>
     <w:p>
@@ -380,7 +372,7 @@
           <w:color w:val="1F2933"/>
           <w:sz w:val="24"/>
         </w:rPr>
-        <w:t>Paso 2. Agrega dos métodos a ProductosPage</w:t>
+        <w:t>Paso 2. Completa ProductosPage</w:t>
       </w:r>
     </w:p>
     <w:p>
@@ -395,13 +387,39 @@
           <w:rFonts w:ascii="Consolas" w:hAnsi="Consolas" w:eastAsia="Consolas"/>
           <w:color w:val="003D7A"/>
         </w:rPr>
-        <w:t>ProductosPage</w:t>
+        <w:t>pages/ProductosPage.ts</w:t>
       </w:r>
       <w:r>
         <w:rPr>
           <w:b w:val="0"/>
         </w:rPr>
-        <w:t xml:space="preserve"> crea dos localizadores privados nuevos y dos métodos públicos:</w:t>
+        <w:t xml:space="preserve"> agrega lo siguiente. Los localizadores se preparan en el constructor y </w:t>
+      </w:r>
+      <w:r>
+        <w:rPr>
+          <w:rFonts w:ascii="Consolas" w:hAnsi="Consolas" w:eastAsia="Consolas"/>
+          <w:color w:val="003D7A"/>
+        </w:rPr>
+        <w:t>getByTestId('...')</w:t>
+      </w:r>
+      <w:r>
+        <w:rPr>
+          <w:b w:val="0"/>
+        </w:rPr>
+        <w:t xml:space="preserve"> busca el atributo </w:t>
+      </w:r>
+      <w:r>
+        <w:rPr>
+          <w:rFonts w:ascii="Consolas" w:hAnsi="Consolas" w:eastAsia="Consolas"/>
+          <w:color w:val="003D7A"/>
+        </w:rPr>
+        <w:t>data-test</w:t>
+      </w:r>
+      <w:r>
+        <w:rPr>
+          <w:b w:val="0"/>
+        </w:rPr>
+        <w:t>.</w:t>
       </w:r>
     </w:p>
     <w:p>
@@ -411,16 +429,35 @@
       </w:pPr>
       <w:r>
         <w:rPr>
+          <w:b w:val="0"/>
+        </w:rPr>
+        <w:t xml:space="preserve">Un localizador </w:t>
+      </w:r>
+      <w:r>
+        <w:rPr>
           <w:rFonts w:ascii="Consolas" w:hAnsi="Consolas" w:eastAsia="Consolas"/>
           <w:color w:val="003D7A"/>
         </w:rPr>
-        <w:t>agregarMochilaAlCarrito()</w:t>
+        <w:t>private readonly botonAgregarMochila</w:t>
       </w:r>
       <w:r>
         <w:rPr>
           <w:b w:val="0"/>
         </w:rPr>
-        <w:t>: hace clic en el botón Add to cart de la mochila.</w:t>
+        <w:t xml:space="preserve"> y un método </w:t>
+      </w:r>
+      <w:r>
+        <w:rPr>
+          <w:rFonts w:ascii="Consolas" w:hAnsi="Consolas" w:eastAsia="Consolas"/>
+          <w:color w:val="003D7A"/>
+        </w:rPr>
+        <w:t>async agregarMochilaAlCarrito()</w:t>
+      </w:r>
+      <w:r>
+        <w:rPr>
+          <w:b w:val="0"/>
+        </w:rPr>
+        <w:t xml:space="preserve"> que haga clic en él.</w:t>
       </w:r>
     </w:p>
     <w:p>
@@ -430,29 +467,22 @@
       </w:pPr>
       <w:r>
         <w:rPr>
-          <w:rFonts w:ascii="Consolas" w:hAnsi="Consolas" w:eastAsia="Consolas"/>
-          <w:color w:val="003D7A"/>
-        </w:rPr>
-        <w:t>cantidadEnCarrito()</w:t>
-      </w:r>
-      <w:r>
-        <w:rPr>
           <w:b w:val="0"/>
         </w:rPr>
-        <w:t xml:space="preserve">: devuelve el texto del numerito del carrito (un </w:t>
+        <w:t xml:space="preserve">Un localizador público </w:t>
       </w:r>
       <w:r>
         <w:rPr>
           <w:rFonts w:ascii="Consolas" w:hAnsi="Consolas" w:eastAsia="Consolas"/>
           <w:color w:val="003D7A"/>
         </w:rPr>
-        <w:t>String</w:t>
+        <w:t>readonly contadorCarrito</w:t>
       </w:r>
       <w:r>
         <w:rPr>
           <w:b w:val="0"/>
         </w:rPr>
-        <w:t>).</w:t>
+        <w:t xml:space="preserve"> para el numerito del carrito.</w:t>
       </w:r>
     </w:p>
     <w:p>
@@ -474,79 +504,14 @@
         <w:rPr>
           <w:b w:val="0"/>
         </w:rPr>
-        <w:t xml:space="preserve">En la carpeta </w:t>
+        <w:t xml:space="preserve">Crea el archivo </w:t>
       </w:r>
       <w:r>
         <w:rPr>
           <w:rFonts w:ascii="Consolas" w:hAnsi="Consolas" w:eastAsia="Consolas"/>
           <w:color w:val="003D7A"/>
         </w:rPr>
-        <w:t>src/test/java/co/com/semillero/playwright/tests</w:t>
-      </w:r>
-      <w:r>
-        <w:rPr>
-          <w:b w:val="0"/>
-        </w:rPr>
-        <w:t xml:space="preserve"> crea la clase </w:t>
-      </w:r>
-      <w:r>
-        <w:rPr>
-          <w:rFonts w:ascii="Consolas" w:hAnsi="Consolas" w:eastAsia="Consolas"/>
-          <w:color w:val="003D7A"/>
-        </w:rPr>
-        <w:t>CarritoTest</w:t>
-      </w:r>
-      <w:r>
-        <w:rPr>
-          <w:b w:val="0"/>
-        </w:rPr>
-        <w:t xml:space="preserve">, que herede de </w:t>
-      </w:r>
-      <w:r>
-        <w:rPr>
-          <w:rFonts w:ascii="Consolas" w:hAnsi="Consolas" w:eastAsia="Consolas"/>
-          <w:color w:val="003D7A"/>
-        </w:rPr>
-        <w:t>BaseTest</w:t>
-      </w:r>
-      <w:r>
-        <w:rPr>
-          <w:b w:val="0"/>
-        </w:rPr>
-        <w:t xml:space="preserve">, con una prueba </w:t>
-      </w:r>
-      <w:r>
-        <w:rPr>
-          <w:rFonts w:ascii="Consolas" w:hAnsi="Consolas" w:eastAsia="Consolas"/>
-          <w:color w:val="003D7A"/>
-        </w:rPr>
-        <w:t>agregarProductoAlCarrito</w:t>
-      </w:r>
-      <w:r>
-        <w:rPr>
-          <w:b w:val="0"/>
-        </w:rPr>
-        <w:t xml:space="preserve">. La prueba debe iniciar sesión, agregar la mochila y comparar con </w:t>
-      </w:r>
-      <w:r>
-        <w:rPr>
-          <w:rFonts w:ascii="Consolas" w:hAnsi="Consolas" w:eastAsia="Consolas"/>
-          <w:color w:val="003D7A"/>
-        </w:rPr>
-        <w:t>assertEquals</w:t>
-      </w:r>
-      <w:r>
-        <w:rPr>
-          <w:b w:val="0"/>
-        </w:rPr>
-        <w:t xml:space="preserve"> que la cantidad en el carrito sea </w:t>
-      </w:r>
-      <w:r>
-        <w:rPr>
-          <w:rFonts w:ascii="Consolas" w:hAnsi="Consolas" w:eastAsia="Consolas"/>
-          <w:color w:val="003D7A"/>
-        </w:rPr>
-        <w:t>"1"</w:t>
+        <w:t>tests/carrito.spec.ts</w:t>
       </w:r>
       <w:r>
         <w:rPr>
@@ -587,7 +552,7 @@
                 <w:color w:val="52606D"/>
                 <w:sz w:val="18"/>
               </w:rPr>
-              <w:t>CarritoTest.java</w:t>
+              <w:t>tests/carrito.spec.ts</w:t>
             </w:r>
           </w:p>
           <w:p>
@@ -601,7 +566,49 @@
                 <w:color w:val="1F2933"/>
                 <w:sz w:val="19"/>
               </w:rPr>
-              <w:t>public class CarritoTest extends BaseTest {</w:t>
+              <w:t>import { test, expect } from '@playwright/test';</w:t>
+            </w:r>
+          </w:p>
+          <w:p>
+            <w:pPr>
+              <w:keepNext/>
+              <w:spacing w:after="0" w:line="240" w:lineRule="auto"/>
+            </w:pPr>
+            <w:r>
+              <w:rPr>
+                <w:rFonts w:ascii="Consolas" w:hAnsi="Consolas" w:eastAsia="Consolas"/>
+                <w:color w:val="1F2933"/>
+                <w:sz w:val="19"/>
+              </w:rPr>
+              <w:t>import { LoginPage } from '../pages/LoginPage';</w:t>
+            </w:r>
+          </w:p>
+          <w:p>
+            <w:pPr>
+              <w:keepNext/>
+              <w:spacing w:after="0" w:line="240" w:lineRule="auto"/>
+            </w:pPr>
+            <w:r>
+              <w:rPr>
+                <w:rFonts w:ascii="Consolas" w:hAnsi="Consolas" w:eastAsia="Consolas"/>
+                <w:color w:val="1F2933"/>
+                <w:sz w:val="19"/>
+              </w:rPr>
+              <w:t>import { ProductosPage } from '../pages/ProductosPage';</w:t>
+            </w:r>
+          </w:p>
+          <w:p>
+            <w:pPr>
+              <w:keepNext/>
+              <w:spacing w:after="0" w:line="240" w:lineRule="auto"/>
+            </w:pPr>
+            <w:r>
+              <w:rPr>
+                <w:rFonts w:ascii="Consolas" w:hAnsi="Consolas" w:eastAsia="Consolas"/>
+                <w:color w:val="1F2933"/>
+                <w:sz w:val="19"/>
+              </w:rPr>
+              <w:t>import { usuarioEstandar } from '../data/usuarios';</w:t>
             </w:r>
           </w:p>
           <w:p>
@@ -629,7 +636,7 @@
                 <w:color w:val="1F2933"/>
                 <w:sz w:val="19"/>
               </w:rPr>
-              <w:t xml:space="preserve">    // Escribe aquí qué valida esta prueba.</w:t>
+              <w:t>// Escribe aquí qué agrupa este archivo.</w:t>
             </w:r>
           </w:p>
           <w:p>
@@ -643,7 +650,7 @@
                 <w:color w:val="1F2933"/>
                 <w:sz w:val="19"/>
               </w:rPr>
-              <w:t xml:space="preserve">    @Test</w:t>
+              <w:t>test.describe('Carrito de compras', () =&gt; {</w:t>
             </w:r>
           </w:p>
           <w:p>
@@ -657,7 +664,7 @@
                 <w:color w:val="1F2933"/>
                 <w:sz w:val="19"/>
               </w:rPr>
-              <w:t xml:space="preserve">    @DisplayName("Agregar un producto muestra 1 en el carrito")</w:t>
+              <w:t xml:space="preserve">  // Escribe aquí qué valida esta prueba.</w:t>
             </w:r>
           </w:p>
           <w:p>
@@ -671,7 +678,7 @@
                 <w:color w:val="1F2933"/>
                 <w:sz w:val="19"/>
               </w:rPr>
-              <w:t xml:space="preserve">    void agregarProductoAlCarrito() {</w:t>
+              <w:t xml:space="preserve">  test('agregar la mochila muestra 1 en el carrito', async ({ page }) =&gt; {</w:t>
             </w:r>
           </w:p>
           <w:p>
@@ -685,7 +692,7 @@
                 <w:color w:val="1F2933"/>
                 <w:sz w:val="19"/>
               </w:rPr>
-              <w:t xml:space="preserve">        // 1. Abrir el login e iniciar sesión (igual que en LoginTest)</w:t>
+              <w:t xml:space="preserve">    // 1. Abrir el login e iniciar sesión (igual que en login.spec.ts)</w:t>
             </w:r>
           </w:p>
           <w:p>
@@ -699,7 +706,7 @@
                 <w:color w:val="1F2933"/>
                 <w:sz w:val="19"/>
               </w:rPr>
-              <w:t xml:space="preserve">        // 2. Crear ProductosPage y agregar la mochila</w:t>
+              <w:t xml:space="preserve">    // 2. Crear ProductosPage y agregar la mochila</w:t>
             </w:r>
           </w:p>
           <w:p>
@@ -713,7 +720,7 @@
                 <w:color w:val="1F2933"/>
                 <w:sz w:val="19"/>
               </w:rPr>
-              <w:t xml:space="preserve">        // 3. assertEquals("1", ...)</w:t>
+              <w:t xml:space="preserve">    // 3. await expect(...).toHaveText('1');</w:t>
             </w:r>
           </w:p>
           <w:p>
@@ -727,7 +734,7 @@
                 <w:color w:val="1F2933"/>
                 <w:sz w:val="19"/>
               </w:rPr>
-              <w:t xml:space="preserve">    }</w:t>
+              <w:t xml:space="preserve">  });</w:t>
             </w:r>
           </w:p>
           <w:p>
@@ -741,7 +748,7 @@
                 <w:color w:val="1F2933"/>
                 <w:sz w:val="19"/>
               </w:rPr>
-              <w:t>}</w:t>
+              <w:t>});</w:t>
             </w:r>
           </w:p>
         </w:tc>
@@ -763,7 +770,7 @@
           <w:color w:val="1F2933"/>
           <w:sz w:val="24"/>
         </w:rPr>
-        <w:t>Paso 4. Ejecuta</w:t>
+        <w:t>Paso 4. Ejecuta y toma las capturas</w:t>
       </w:r>
     </w:p>
     <w:p>
@@ -778,39 +785,39 @@
           <w:rFonts w:ascii="Consolas" w:hAnsi="Consolas" w:eastAsia="Consolas"/>
           <w:color w:val="003D7A"/>
         </w:rPr>
-        <w:t>gradle test</w:t>
+        <w:t>npm test</w:t>
       </w:r>
       <w:r>
         <w:rPr>
           <w:b w:val="0"/>
         </w:rPr>
-        <w:t xml:space="preserve">. Deben pasar 6 pruebas: las 5 que ya estaban y la tuya. Toma una captura de la consola donde se vea </w:t>
+        <w:t xml:space="preserve">. Deben salir </w:t>
       </w:r>
       <w:r>
         <w:rPr>
           <w:rFonts w:ascii="Consolas" w:hAnsi="Consolas" w:eastAsia="Consolas"/>
           <w:color w:val="003D7A"/>
         </w:rPr>
-        <w:t>CarritoTest ... PASSED</w:t>
+        <w:t>6 passed</w:t>
       </w:r>
       <w:r>
         <w:rPr>
           <w:b w:val="0"/>
         </w:rPr>
-        <w:t xml:space="preserve"> y </w:t>
+        <w:t xml:space="preserve">: las 5 que ya estaban y la tuya. Toma una captura de la terminal. Luego corre </w:t>
       </w:r>
       <w:r>
         <w:rPr>
           <w:rFonts w:ascii="Consolas" w:hAnsi="Consolas" w:eastAsia="Consolas"/>
           <w:color w:val="003D7A"/>
         </w:rPr>
-        <w:t>BUILD SUCCESSFUL</w:t>
+        <w:t>npm run reporte</w:t>
       </w:r>
       <w:r>
         <w:rPr>
           <w:b w:val="0"/>
         </w:rPr>
-        <w:t>. No olvides el comentario encima de cada localizador, método y prueba que agregues.</w:t>
+        <w:t xml:space="preserve"> y toma otra captura del reporte HTML donde se vea tu prueba en verde.</w:t>
       </w:r>
     </w:p>
     <w:p>
@@ -842,20 +849,20 @@
           <w:rFonts w:ascii="Consolas" w:hAnsi="Consolas" w:eastAsia="Consolas"/>
           <w:color w:val="003D7A"/>
         </w:rPr>
-        <w:t>CarritoPage</w:t>
+        <w:t>pages/CarritoPage.ts</w:t>
       </w:r>
       <w:r>
         <w:rPr>
           <w:b w:val="0"/>
         </w:rPr>
-        <w:t xml:space="preserve">, el control remoto de la pantalla del carrito, con un método </w:t>
+        <w:t xml:space="preserve">, el control remoto de la pantalla del carrito, con un localizador público </w:t>
       </w:r>
       <w:r>
         <w:rPr>
           <w:rFonts w:ascii="Consolas" w:hAnsi="Consolas" w:eastAsia="Consolas"/>
           <w:color w:val="003D7A"/>
         </w:rPr>
-        <w:t>nombreDelProducto()</w:t>
+        <w:t>nombreProducto</w:t>
       </w:r>
       <w:r>
         <w:rPr>
@@ -894,13 +901,13 @@
           <w:rFonts w:ascii="Consolas" w:hAnsi="Consolas" w:eastAsia="Consolas"/>
           <w:color w:val="003D7A"/>
         </w:rPr>
-        <w:t>CarritoTest</w:t>
+        <w:t>carrito.spec.ts</w:t>
       </w:r>
       <w:r>
         <w:rPr>
           <w:b w:val="0"/>
         </w:rPr>
-        <w:t xml:space="preserve"> una segunda prueba que agregue la mochila, vaya al carrito y valide que el nombre sea </w:t>
+        <w:t xml:space="preserve"> una segunda prueba que agregue la mochila, vaya al carrito y revise que el nombre sea </w:t>
       </w:r>
       <w:r>
         <w:rPr>
@@ -934,7 +941,20 @@
         <w:rPr>
           <w:b w:val="0"/>
         </w:rPr>
-        <w:t xml:space="preserve"> para el nombre de los productos. Si te sale un error de strict mode, piensa cómo buscar el nombre solo dentro de la lista del carrito.</w:t>
+        <w:t xml:space="preserve"> para el nombre de los productos. Si te sale </w:t>
+      </w:r>
+      <w:r>
+        <w:rPr>
+          <w:rFonts w:ascii="Consolas" w:hAnsi="Consolas" w:eastAsia="Consolas"/>
+          <w:color w:val="003D7A"/>
+        </w:rPr>
+        <w:t>strict mode violation</w:t>
+      </w:r>
+      <w:r>
+        <w:rPr>
+          <w:b w:val="0"/>
+        </w:rPr>
+        <w:t>, busca el nombre solo dentro de la lista del carrito.</w:t>
       </w:r>
     </w:p>
     <w:p>
@@ -1010,7 +1030,20 @@
           <w:rFonts w:ascii="Consolas" w:hAnsi="Consolas" w:eastAsia="Consolas"/>
           <w:color w:val="003D7A"/>
         </w:rPr>
-        <w:t>build</w:t>
+        <w:t>node_modules</w:t>
+      </w:r>
+      <w:r>
+        <w:rPr>
+          <w:b w:val="0"/>
+        </w:rPr>
+        <w:t xml:space="preserve">, </w:t>
+      </w:r>
+      <w:r>
+        <w:rPr>
+          <w:rFonts w:ascii="Consolas" w:hAnsi="Consolas" w:eastAsia="Consolas"/>
+          <w:color w:val="003D7A"/>
+        </w:rPr>
+        <w:t>test-results</w:t>
       </w:r>
       <w:r>
         <w:rPr>
@@ -1023,7 +1056,7 @@
           <w:rFonts w:ascii="Consolas" w:hAnsi="Consolas" w:eastAsia="Consolas"/>
           <w:color w:val="003D7A"/>
         </w:rPr>
-        <w:t>.gradle</w:t>
+        <w:t>playwright-report</w:t>
       </w:r>
       <w:r>
         <w:rPr>
@@ -1037,7 +1070,20 @@
         <w:rPr>
           <w:b w:val="0"/>
         </w:rPr>
-        <w:t>En los dos casos adjunta la captura de la ejecución en verde.</w:t>
+        <w:t xml:space="preserve">En los dos casos adjunta las dos capturas: la de </w:t>
+      </w:r>
+      <w:r>
+        <w:rPr>
+          <w:rFonts w:ascii="Consolas" w:hAnsi="Consolas" w:eastAsia="Consolas"/>
+          <w:color w:val="003D7A"/>
+        </w:rPr>
+        <w:t>npm test</w:t>
+      </w:r>
+      <w:r>
+        <w:rPr>
+          <w:b w:val="0"/>
+        </w:rPr>
+        <w:t xml:space="preserve"> en verde y la del reporte HTML.</w:t>
       </w:r>
     </w:p>
     <w:p>
@@ -1075,7 +1121,7 @@
         </w:trPr>
         <w:tc>
           <w:tcPr>
-            <w:tcW w:type="dxa" w:w="2381"/>
+            <w:tcW w:type="dxa" w:w="2268"/>
             <w:shd w:val="clear" w:color="auto" w:fill="003D7A"/>
             <w:tcBorders>
               <w:top w:val="single" w:sz="6" w:color="D0D7DE"/>
@@ -1100,7 +1146,7 @@
         </w:tc>
         <w:tc>
           <w:tcPr>
-            <w:tcW w:type="dxa" w:w="6123"/>
+            <w:tcW w:type="dxa" w:w="6236"/>
             <w:shd w:val="clear" w:color="auto" w:fill="003D7A"/>
             <w:tcBorders>
               <w:top w:val="single" w:sz="6" w:color="D0D7DE"/>
@@ -1155,7 +1201,7 @@
         </w:trPr>
         <w:tc>
           <w:tcPr>
-            <w:tcW w:type="dxa" w:w="2381"/>
+            <w:tcW w:type="dxa" w:w="2268"/>
             <w:tcBorders>
               <w:top w:val="single" w:sz="6" w:color="D0D7DE"/>
               <w:left w:val="single" w:sz="6" w:color="D0D7DE"/>
@@ -1172,13 +1218,13 @@
                 <w:b w:val="0"/>
                 <w:sz w:val="20"/>
               </w:rPr>
-              <w:t>Métodos en ProductosPage</w:t>
+              <w:t>ProductosPage</w:t>
             </w:r>
           </w:p>
         </w:tc>
         <w:tc>
           <w:tcPr>
-            <w:tcW w:type="dxa" w:w="6123"/>
+            <w:tcW w:type="dxa" w:w="6236"/>
             <w:tcBorders>
               <w:top w:val="single" w:sz="6" w:color="D0D7DE"/>
               <w:left w:val="single" w:sz="6" w:color="D0D7DE"/>
@@ -1195,7 +1241,7 @@
                 <w:b w:val="0"/>
                 <w:sz w:val="20"/>
               </w:rPr>
-              <w:t>Los dos métodos existen, funcionan y los localizadores son private.</w:t>
+              <w:t>El método y los dos localizadores existen, funcionan y el botón es private.</w:t>
             </w:r>
           </w:p>
         </w:tc>
@@ -1229,7 +1275,7 @@
         </w:trPr>
         <w:tc>
           <w:tcPr>
-            <w:tcW w:type="dxa" w:w="2381"/>
+            <w:tcW w:type="dxa" w:w="2268"/>
             <w:shd w:val="clear" w:color="auto" w:fill="F2F5F9"/>
             <w:tcBorders>
               <w:top w:val="single" w:sz="6" w:color="D0D7DE"/>
@@ -1247,13 +1293,13 @@
                 <w:b w:val="0"/>
                 <w:sz w:val="20"/>
               </w:rPr>
-              <w:t>Prueba CarritoTest</w:t>
+              <w:t>carrito.spec.ts</w:t>
             </w:r>
           </w:p>
         </w:tc>
         <w:tc>
           <w:tcPr>
-            <w:tcW w:type="dxa" w:w="6123"/>
+            <w:tcW w:type="dxa" w:w="6236"/>
             <w:shd w:val="clear" w:color="auto" w:fill="F2F5F9"/>
             <w:tcBorders>
               <w:top w:val="single" w:sz="6" w:color="D0D7DE"/>
@@ -1271,7 +1317,7 @@
                 <w:b w:val="0"/>
                 <w:sz w:val="20"/>
               </w:rPr>
-              <w:t>Hereda de BaseTest, usa las páginas (no localizadores sueltos) y valida con assertEquals.</w:t>
+              <w:t>Usa LoginPage y ProductosPage (sin localizadores sueltos en la prueba) y revisa con await expect.</w:t>
             </w:r>
           </w:p>
         </w:tc>
@@ -1306,7 +1352,7 @@
         </w:trPr>
         <w:tc>
           <w:tcPr>
-            <w:tcW w:type="dxa" w:w="2381"/>
+            <w:tcW w:type="dxa" w:w="2268"/>
             <w:tcBorders>
               <w:top w:val="single" w:sz="6" w:color="D0D7DE"/>
               <w:left w:val="single" w:sz="6" w:color="D0D7DE"/>
@@ -1323,13 +1369,13 @@
                 <w:b w:val="0"/>
                 <w:sz w:val="20"/>
               </w:rPr>
-              <w:t>Ejecución</w:t>
+              <w:t>Ejecución y capturas</w:t>
             </w:r>
           </w:p>
         </w:tc>
         <w:tc>
           <w:tcPr>
-            <w:tcW w:type="dxa" w:w="6123"/>
+            <w:tcW w:type="dxa" w:w="6236"/>
             <w:tcBorders>
               <w:top w:val="single" w:sz="6" w:color="D0D7DE"/>
               <w:left w:val="single" w:sz="6" w:color="D0D7DE"/>
@@ -1346,7 +1392,7 @@
                 <w:b w:val="0"/>
                 <w:sz w:val="20"/>
               </w:rPr>
-              <w:t>gradle test pasa completo (6 pruebas) y la captura lo muestra.</w:t>
+              <w:t>npm test pasa completo (6 pruebas) y las dos capturas lo muestran.</w:t>
             </w:r>
           </w:p>
         </w:tc>
@@ -1380,7 +1426,7 @@
         </w:trPr>
         <w:tc>
           <w:tcPr>
-            <w:tcW w:type="dxa" w:w="2381"/>
+            <w:tcW w:type="dxa" w:w="2268"/>
             <w:shd w:val="clear" w:color="auto" w:fill="F2F5F9"/>
             <w:tcBorders>
               <w:top w:val="single" w:sz="6" w:color="D0D7DE"/>
@@ -1398,13 +1444,13 @@
                 <w:b w:val="0"/>
                 <w:sz w:val="20"/>
               </w:rPr>
-              <w:t>Orden y comentarios</w:t>
+              <w:t>Orden y entrega</w:t>
             </w:r>
           </w:p>
         </w:tc>
         <w:tc>
           <w:tcPr>
-            <w:tcW w:type="dxa" w:w="6123"/>
+            <w:tcW w:type="dxa" w:w="6236"/>
             <w:shd w:val="clear" w:color="auto" w:fill="F2F5F9"/>
             <w:tcBorders>
               <w:top w:val="single" w:sz="6" w:color="D0D7DE"/>
@@ -1422,7 +1468,7 @@
                 <w:b w:val="0"/>
                 <w:sz w:val="20"/>
               </w:rPr>
-              <w:t>Nombres en español, un comentario encima de cada cosa nueva, entrega sin build.</w:t>
+              <w:t>Nombres claros en español, un comentario encima de cada cosa nueva, entrega sin node_modules.</w:t>
             </w:r>
           </w:p>
         </w:tc>
@@ -1457,7 +1503,7 @@
         </w:trPr>
         <w:tc>
           <w:tcPr>
-            <w:tcW w:type="dxa" w:w="2381"/>
+            <w:tcW w:type="dxa" w:w="2268"/>
             <w:tcBorders>
               <w:top w:val="single" w:sz="6" w:color="D0D7DE"/>
               <w:left w:val="single" w:sz="6" w:color="D0D7DE"/>
@@ -1477,7 +1523,7 @@
         </w:tc>
         <w:tc>
           <w:tcPr>
-            <w:tcW w:type="dxa" w:w="6123"/>
+            <w:tcW w:type="dxa" w:w="6236"/>
             <w:tcBorders>
               <w:top w:val="single" w:sz="6" w:color="D0D7DE"/>
               <w:left w:val="single" w:sz="6" w:color="D0D7DE"/>
@@ -1541,58 +1587,20 @@
           <w:rFonts w:ascii="Consolas" w:hAnsi="Consolas" w:eastAsia="Consolas"/>
           <w:color w:val="003D7A"/>
         </w:rPr>
-        <w:t>gradle test</w:t>
+        <w:t>npm test</w:t>
       </w:r>
       <w:r>
         <w:rPr>
           <w:b w:val="0"/>
         </w:rPr>
-        <w:t xml:space="preserve"> termina en </w:t>
+        <w:t xml:space="preserve"> termina con </w:t>
       </w:r>
       <w:r>
         <w:rPr>
           <w:rFonts w:ascii="Consolas" w:hAnsi="Consolas" w:eastAsia="Consolas"/>
           <w:color w:val="003D7A"/>
         </w:rPr>
-        <w:t>BUILD SUCCESSFUL</w:t>
-      </w:r>
-      <w:r>
-        <w:rPr>
-          <w:b w:val="0"/>
-        </w:rPr>
-        <w:t xml:space="preserve"> con 6 pruebas.</w:t>
-      </w:r>
-    </w:p>
-    <w:p>
-      <w:pPr>
-        <w:pStyle w:val="ListBullet"/>
-        <w:spacing w:after="60"/>
-      </w:pPr>
-      <w:r>
-        <w:rPr>
-          <w:b w:val="0"/>
-        </w:rPr>
-        <w:t xml:space="preserve">Los localizadores nuevos están en </w:t>
-      </w:r>
-      <w:r>
-        <w:rPr>
-          <w:rFonts w:ascii="Consolas" w:hAnsi="Consolas" w:eastAsia="Consolas"/>
-          <w:color w:val="003D7A"/>
-        </w:rPr>
-        <w:t>ProductosPage</w:t>
-      </w:r>
-      <w:r>
-        <w:rPr>
-          <w:b w:val="0"/>
-        </w:rPr>
-        <w:t xml:space="preserve">, son </w:t>
-      </w:r>
-      <w:r>
-        <w:rPr>
-          <w:rFonts w:ascii="Consolas" w:hAnsi="Consolas" w:eastAsia="Consolas"/>
-          <w:color w:val="003D7A"/>
-        </w:rPr>
-        <w:t>private</w:t>
+        <w:t>6 passed</w:t>
       </w:r>
       <w:r>
         <w:rPr>
@@ -1605,26 +1613,13 @@
           <w:rFonts w:ascii="Consolas" w:hAnsi="Consolas" w:eastAsia="Consolas"/>
           <w:color w:val="003D7A"/>
         </w:rPr>
-        <w:t>CarritoTest</w:t>
+        <w:t>carrito.spec.ts</w:t>
       </w:r>
       <w:r>
         <w:rPr>
           <w:b w:val="0"/>
         </w:rPr>
-        <w:t xml:space="preserve"> no tiene ningún </w:t>
-      </w:r>
-      <w:r>
-        <w:rPr>
-          <w:rFonts w:ascii="Consolas" w:hAnsi="Consolas" w:eastAsia="Consolas"/>
-          <w:color w:val="003D7A"/>
-        </w:rPr>
-        <w:t>locator(...)</w:t>
-      </w:r>
-      <w:r>
-        <w:rPr>
-          <w:b w:val="0"/>
-        </w:rPr>
-        <w:t>.</w:t>
+        <w:t xml:space="preserve"> no tiene localizadores adentro.</w:t>
       </w:r>
     </w:p>
     <w:p>
@@ -1636,7 +1631,20 @@
         <w:rPr>
           <w:b w:val="0"/>
         </w:rPr>
-        <w:t>Cada cosa nueva tiene su comentario.</w:t>
+        <w:t xml:space="preserve">Cada acción y cada expect tienen su </w:t>
+      </w:r>
+      <w:r>
+        <w:rPr>
+          <w:rFonts w:ascii="Consolas" w:hAnsi="Consolas" w:eastAsia="Consolas"/>
+          <w:color w:val="003D7A"/>
+        </w:rPr>
+        <w:t>await</w:t>
+      </w:r>
+      <w:r>
+        <w:rPr>
+          <w:b w:val="0"/>
+        </w:rPr>
+        <w:t>, y cada cosa nueva su comentario.</w:t>
       </w:r>
     </w:p>
     <w:p>
@@ -1648,27 +1656,14 @@
         <w:rPr>
           <w:b w:val="0"/>
         </w:rPr>
-        <w:t xml:space="preserve">Adjuntaste la captura, y el .zip no tiene </w:t>
+        <w:t xml:space="preserve">Adjuntaste las dos capturas, y el .zip no tiene </w:t>
       </w:r>
       <w:r>
         <w:rPr>
           <w:rFonts w:ascii="Consolas" w:hAnsi="Consolas" w:eastAsia="Consolas"/>
           <w:color w:val="003D7A"/>
         </w:rPr>
-        <w:t>build</w:t>
-      </w:r>
-      <w:r>
-        <w:rPr>
-          <w:b w:val="0"/>
-        </w:rPr>
-        <w:t xml:space="preserve"> ni </w:t>
-      </w:r>
-      <w:r>
-        <w:rPr>
-          <w:rFonts w:ascii="Consolas" w:hAnsi="Consolas" w:eastAsia="Consolas"/>
-          <w:color w:val="003D7A"/>
-        </w:rPr>
-        <w:t>.gradle</w:t>
+        <w:t>node_modules</w:t>
       </w:r>
       <w:r>
         <w:rPr>

</xml_diff>